<commit_message>
fix: filtrando consulta 6.1 por status 'Aprovado'
</commit_message>
<xml_diff>
--- a/Doc-emilly-pedro/Atividade_BD_Pedro_Emilly.docx
+++ b/Doc-emilly-pedro/Atividade_BD_Pedro_Emilly.docx
@@ -202,7 +202,6 @@
           <w:szCs w:val="32"/>
         </w:rPr>
       </w:pPr>
-      <w:proofErr w:type="spellStart"/>
       <w:r>
         <w:rPr>
           <w:rFonts w:ascii="Century Gothic" w:eastAsia="Century Gothic" w:hAnsi="Century Gothic" w:cs="Century Gothic"/>
@@ -212,9 +211,8 @@
           <w:sz w:val="32"/>
           <w:szCs w:val="32"/>
         </w:rPr>
-        <w:t>Profº</w:t>
-      </w:r>
-      <w:proofErr w:type="spellEnd"/>
+        <w:t xml:space="preserve">Profº </w:t>
+      </w:r>
       <w:r>
         <w:rPr>
           <w:rFonts w:ascii="Century Gothic" w:eastAsia="Century Gothic" w:hAnsi="Century Gothic" w:cs="Century Gothic"/>
@@ -224,9 +222,14 @@
           <w:sz w:val="32"/>
           <w:szCs w:val="32"/>
         </w:rPr>
-        <w:t xml:space="preserve"> </w:t>
-      </w:r>
-      <w:r>
+        <w:t>Carlos Uchoa e William Sestito</w:t>
+      </w:r>
+      <w:r>
+        <w:br/>
+      </w:r>
+    </w:p>
+    <w:p>
+      <w:pPr>
         <w:rPr>
           <w:rFonts w:ascii="Century Gothic" w:eastAsia="Century Gothic" w:hAnsi="Century Gothic" w:cs="Century Gothic"/>
           <w:b/>
@@ -235,10 +238,11 @@
           <w:sz w:val="32"/>
           <w:szCs w:val="32"/>
         </w:rPr>
-        <w:t xml:space="preserve">Carlos Uchoa e William </w:t>
-      </w:r>
-      <w:proofErr w:type="spellStart"/>
-      <w:r>
+      </w:pPr>
+    </w:p>
+    <w:p>
+      <w:pPr>
+        <w:jc w:val="center"/>
         <w:rPr>
           <w:rFonts w:ascii="Century Gothic" w:eastAsia="Century Gothic" w:hAnsi="Century Gothic" w:cs="Century Gothic"/>
           <w:b/>
@@ -247,15 +251,8 @@
           <w:sz w:val="32"/>
           <w:szCs w:val="32"/>
         </w:rPr>
-        <w:t>Sestito</w:t>
-      </w:r>
-      <w:proofErr w:type="spellEnd"/>
-      <w:r>
-        <w:br/>
-      </w:r>
-    </w:p>
-    <w:p>
-      <w:pPr>
+      </w:pPr>
+      <w:r>
         <w:rPr>
           <w:rFonts w:ascii="Century Gothic" w:eastAsia="Century Gothic" w:hAnsi="Century Gothic" w:cs="Century Gothic"/>
           <w:b/>
@@ -264,11 +261,9 @@
           <w:sz w:val="32"/>
           <w:szCs w:val="32"/>
         </w:rPr>
-      </w:pPr>
-    </w:p>
-    <w:p>
-      <w:pPr>
-        <w:jc w:val="center"/>
+        <w:t>Aluno</w:t>
+      </w:r>
+      <w:r>
         <w:rPr>
           <w:rFonts w:ascii="Century Gothic" w:eastAsia="Century Gothic" w:hAnsi="Century Gothic" w:cs="Century Gothic"/>
           <w:b/>
@@ -277,7 +272,8 @@
           <w:sz w:val="32"/>
           <w:szCs w:val="32"/>
         </w:rPr>
-      </w:pPr>
+        <w:t>s</w:t>
+      </w:r>
       <w:r>
         <w:rPr>
           <w:rFonts w:ascii="Century Gothic" w:eastAsia="Century Gothic" w:hAnsi="Century Gothic" w:cs="Century Gothic"/>
@@ -287,53 +283,7 @@
           <w:sz w:val="32"/>
           <w:szCs w:val="32"/>
         </w:rPr>
-        <w:t>Aluno</w:t>
-      </w:r>
-      <w:r>
-        <w:rPr>
-          <w:rFonts w:ascii="Century Gothic" w:eastAsia="Century Gothic" w:hAnsi="Century Gothic" w:cs="Century Gothic"/>
-          <w:b/>
-          <w:bCs/>
-          <w:color w:val="3C60A7"/>
-          <w:sz w:val="32"/>
-          <w:szCs w:val="32"/>
-        </w:rPr>
-        <w:t>s</w:t>
-      </w:r>
-      <w:r>
-        <w:rPr>
-          <w:rFonts w:ascii="Century Gothic" w:eastAsia="Century Gothic" w:hAnsi="Century Gothic" w:cs="Century Gothic"/>
-          <w:b/>
-          <w:bCs/>
-          <w:color w:val="3C60A7"/>
-          <w:sz w:val="32"/>
-          <w:szCs w:val="32"/>
-        </w:rPr>
-        <w:t xml:space="preserve">(a): </w:t>
-      </w:r>
-      <w:proofErr w:type="spellStart"/>
-      <w:r>
-        <w:rPr>
-          <w:rFonts w:ascii="Century Gothic" w:eastAsia="Century Gothic" w:hAnsi="Century Gothic" w:cs="Century Gothic"/>
-          <w:b/>
-          <w:bCs/>
-          <w:color w:val="3C60A7"/>
-          <w:sz w:val="32"/>
-          <w:szCs w:val="32"/>
-        </w:rPr>
-        <w:t>Emilly</w:t>
-      </w:r>
-      <w:proofErr w:type="spellEnd"/>
-      <w:r>
-        <w:rPr>
-          <w:rFonts w:ascii="Century Gothic" w:eastAsia="Century Gothic" w:hAnsi="Century Gothic" w:cs="Century Gothic"/>
-          <w:b/>
-          <w:bCs/>
-          <w:color w:val="3C60A7"/>
-          <w:sz w:val="32"/>
-          <w:szCs w:val="32"/>
-        </w:rPr>
-        <w:t xml:space="preserve"> da Luz</w:t>
+        <w:t>(a): Emilly da Luz</w:t>
       </w:r>
       <w:r>
         <w:rPr>
@@ -876,21 +826,12 @@
         </w:rPr>
         <w:t>(</w:t>
       </w:r>
-      <w:proofErr w:type="spellStart"/>
-      <w:r>
-        <w:rPr>
-          <w:b/>
-          <w:bCs/>
-        </w:rPr>
-        <w:t>Emilly</w:t>
-      </w:r>
-      <w:proofErr w:type="spellEnd"/>
-      <w:r>
-        <w:rPr>
-          <w:b/>
-          <w:bCs/>
-        </w:rPr>
-        <w:t xml:space="preserve"> da Silva da Luz</w:t>
+      <w:r>
+        <w:rPr>
+          <w:b/>
+          <w:bCs/>
+        </w:rPr>
+        <w:t>Emilly da Silva da Luz</w:t>
       </w:r>
       <w:r>
         <w:rPr>
@@ -1781,23 +1722,7 @@
           <w:szCs w:val="24"/>
         </w:rPr>
         <w:lastRenderedPageBreak/>
-        <w:t xml:space="preserve">Execute um SELECT * com LIMIT 10 em cada uma das quatro tabelas (clientes, produtos, pedidos, </w:t>
-      </w:r>
-      <w:proofErr w:type="spellStart"/>
-      <w:r>
-        <w:rPr>
-          <w:sz w:val="24"/>
-          <w:szCs w:val="24"/>
-        </w:rPr>
-        <w:t>avaliacoes</w:t>
-      </w:r>
-      <w:proofErr w:type="spellEnd"/>
-      <w:r>
-        <w:rPr>
-          <w:sz w:val="24"/>
-          <w:szCs w:val="24"/>
-        </w:rPr>
-        <w:t>).</w:t>
+        <w:t>Execute um SELECT * com LIMIT 10 em cada uma das quatro tabelas (clientes, produtos, pedidos, avaliacoes).</w:t>
       </w:r>
     </w:p>
     <w:p>
@@ -2036,23 +1961,7 @@
           <w:sz w:val="24"/>
           <w:szCs w:val="24"/>
         </w:rPr>
-        <w:t xml:space="preserve">Execute um SELECT * com LIMIT 10 em cada uma das quatro tabelas (clientes, produtos, pedidos, </w:t>
-      </w:r>
-      <w:proofErr w:type="spellStart"/>
-      <w:r>
-        <w:rPr>
-          <w:sz w:val="24"/>
-          <w:szCs w:val="24"/>
-        </w:rPr>
-        <w:t>avaliacoes</w:t>
-      </w:r>
-      <w:proofErr w:type="spellEnd"/>
-      <w:r>
-        <w:rPr>
-          <w:sz w:val="24"/>
-          <w:szCs w:val="24"/>
-        </w:rPr>
-        <w:t>).</w:t>
+        <w:t>Execute um SELECT * com LIMIT 10 em cada uma das quatro tabelas (clientes, produtos, pedidos, avaliacoes).</w:t>
       </w:r>
     </w:p>
     <w:p>
@@ -2086,39 +1995,7 @@
           <w:sz w:val="24"/>
           <w:szCs w:val="24"/>
         </w:rPr>
-        <w:t xml:space="preserve">Exibe todos os atributos presentes na tabela de clientes, com um </w:t>
-      </w:r>
-      <w:proofErr w:type="spellStart"/>
-      <w:r>
-        <w:rPr>
-          <w:sz w:val="24"/>
-          <w:szCs w:val="24"/>
-        </w:rPr>
-        <w:t>limit</w:t>
-      </w:r>
-      <w:proofErr w:type="spellEnd"/>
-      <w:r>
-        <w:rPr>
-          <w:sz w:val="24"/>
-          <w:szCs w:val="24"/>
-        </w:rPr>
-        <w:t xml:space="preserve"> 10 que é utilizado para criar uma paginação no </w:t>
-      </w:r>
-      <w:proofErr w:type="spellStart"/>
-      <w:r>
-        <w:rPr>
-          <w:sz w:val="24"/>
-          <w:szCs w:val="24"/>
-        </w:rPr>
-        <w:t>select</w:t>
-      </w:r>
-      <w:proofErr w:type="spellEnd"/>
-      <w:r>
-        <w:rPr>
-          <w:sz w:val="24"/>
-          <w:szCs w:val="24"/>
-        </w:rPr>
-        <w:t xml:space="preserve"> e exibir apenas os 10 primeiros valores.</w:t>
+        <w:t>Exibe todos os atributos presentes na tabela de clientes, com um limit 10 que é utilizado para criar uma paginação no select e exibir apenas os 10 primeiros valores.</w:t>
       </w:r>
     </w:p>
     <w:p>
@@ -2343,37 +2220,12 @@
         </w:rPr>
         <w:t xml:space="preserve"> </w:t>
       </w:r>
-      <w:proofErr w:type="spellStart"/>
-      <w:r>
-        <w:rPr>
-          <w:sz w:val="24"/>
-          <w:szCs w:val="24"/>
-        </w:rPr>
-        <w:t>Select</w:t>
-      </w:r>
-      <w:proofErr w:type="spellEnd"/>
-      <w:r>
-        <w:rPr>
-          <w:sz w:val="24"/>
-          <w:szCs w:val="24"/>
-        </w:rPr>
-        <w:t xml:space="preserve"> utilizado para exibir os produtos de maneira simplificada, salvando preço em uma tabela chamada </w:t>
-      </w:r>
-      <w:proofErr w:type="gramStart"/>
-      <w:r>
-        <w:rPr>
-          <w:sz w:val="24"/>
-          <w:szCs w:val="24"/>
-        </w:rPr>
-        <w:t>valor(</w:t>
-      </w:r>
-      <w:proofErr w:type="gramEnd"/>
-      <w:r>
-        <w:rPr>
-          <w:sz w:val="24"/>
-          <w:szCs w:val="24"/>
-        </w:rPr>
-        <w:t>$).</w:t>
+      <w:r>
+        <w:rPr>
+          <w:sz w:val="24"/>
+          <w:szCs w:val="24"/>
+        </w:rPr>
+        <w:t>Select utilizado para exibir os produtos de maneira simplificada, salvando preço em uma tabela chamada valor($).</w:t>
       </w:r>
     </w:p>
     <w:p>
@@ -2521,21 +2373,12 @@
         </w:rPr>
         <w:t>(</w:t>
       </w:r>
-      <w:proofErr w:type="spellStart"/>
-      <w:r>
-        <w:rPr>
-          <w:b/>
-          <w:bCs/>
-        </w:rPr>
-        <w:t>Emilly</w:t>
-      </w:r>
-      <w:proofErr w:type="spellEnd"/>
-      <w:r>
-        <w:rPr>
-          <w:b/>
-          <w:bCs/>
-        </w:rPr>
-        <w:t xml:space="preserve"> da Silva da Luz </w:t>
+      <w:r>
+        <w:rPr>
+          <w:b/>
+          <w:bCs/>
+        </w:rPr>
+        <w:t xml:space="preserve">Emilly da Silva da Luz </w:t>
       </w:r>
       <w:r>
         <w:rPr>
@@ -2574,23 +2417,7 @@
           <w:sz w:val="24"/>
           <w:szCs w:val="24"/>
         </w:rPr>
-        <w:t xml:space="preserve">A diretoria quer saber quantas categorias de produto a </w:t>
-      </w:r>
-      <w:proofErr w:type="spellStart"/>
-      <w:r>
-        <w:rPr>
-          <w:sz w:val="24"/>
-          <w:szCs w:val="24"/>
-        </w:rPr>
-        <w:t>NexaShop</w:t>
-      </w:r>
-      <w:proofErr w:type="spellEnd"/>
-      <w:r>
-        <w:rPr>
-          <w:sz w:val="24"/>
-          <w:szCs w:val="24"/>
-        </w:rPr>
-        <w:t xml:space="preserve"> trabalha antes de decidir se vale abrir uma nova linha. Liste as categorias de produtos sem repetição, em ordem alfabética.</w:t>
+        <w:t>A diretoria quer saber quantas categorias de produto a NexaShop trabalha antes de decidir se vale abrir uma nova linha. Liste as categorias de produtos sem repetição, em ordem alfabética.</w:t>
       </w:r>
     </w:p>
     <w:p>
@@ -2628,7 +2455,6 @@
         </w:rPr>
         <w:t xml:space="preserve"> esta consulta, conseguimos observar que a </w:t>
       </w:r>
-      <w:proofErr w:type="spellStart"/>
       <w:r>
         <w:rPr>
           <w:color w:val="000000" w:themeColor="text1"/>
@@ -2637,7 +2463,6 @@
         </w:rPr>
         <w:t>Nexashop</w:t>
       </w:r>
-      <w:proofErr w:type="spellEnd"/>
       <w:r>
         <w:rPr>
           <w:color w:val="000000" w:themeColor="text1"/>
@@ -2781,21 +2606,12 @@
         </w:rPr>
         <w:t>(</w:t>
       </w:r>
-      <w:proofErr w:type="spellStart"/>
-      <w:r>
-        <w:rPr>
-          <w:b/>
-          <w:bCs/>
-        </w:rPr>
-        <w:t>Emilly</w:t>
-      </w:r>
-      <w:proofErr w:type="spellEnd"/>
-      <w:r>
-        <w:rPr>
-          <w:b/>
-          <w:bCs/>
-        </w:rPr>
-        <w:t xml:space="preserve"> da Silva da Luz </w:t>
+      <w:r>
+        <w:rPr>
+          <w:b/>
+          <w:bCs/>
+        </w:rPr>
+        <w:t xml:space="preserve">Emilly da Silva da Luz </w:t>
       </w:r>
       <w:r>
         <w:rPr>
@@ -2942,21 +2758,12 @@
         </w:rPr>
         <w:t>(</w:t>
       </w:r>
-      <w:proofErr w:type="spellStart"/>
-      <w:r>
-        <w:rPr>
-          <w:b/>
-          <w:bCs/>
-        </w:rPr>
-        <w:t>Emilly</w:t>
-      </w:r>
-      <w:proofErr w:type="spellEnd"/>
-      <w:r>
-        <w:rPr>
-          <w:b/>
-          <w:bCs/>
-        </w:rPr>
-        <w:t xml:space="preserve"> da Silva da Luz </w:t>
+      <w:r>
+        <w:rPr>
+          <w:b/>
+          <w:bCs/>
+        </w:rPr>
+        <w:t xml:space="preserve">Emilly da Silva da Luz </w:t>
       </w:r>
       <w:r>
         <w:rPr>
@@ -4049,21 +3856,12 @@
         </w:rPr>
         <w:t>(</w:t>
       </w:r>
-      <w:proofErr w:type="spellStart"/>
-      <w:r>
-        <w:rPr>
-          <w:b/>
-          <w:bCs/>
-        </w:rPr>
-        <w:t>Emilly</w:t>
-      </w:r>
-      <w:proofErr w:type="spellEnd"/>
-      <w:r>
-        <w:rPr>
-          <w:b/>
-          <w:bCs/>
-        </w:rPr>
-        <w:t xml:space="preserve"> da Silva da Luz </w:t>
+      <w:r>
+        <w:rPr>
+          <w:b/>
+          <w:bCs/>
+        </w:rPr>
+        <w:t xml:space="preserve">Emilly da Silva da Luz </w:t>
       </w:r>
       <w:r>
         <w:rPr>
@@ -4115,23 +3913,7 @@
           <w:sz w:val="24"/>
           <w:szCs w:val="24"/>
         </w:rPr>
-        <w:t xml:space="preserve">Liste os pedidos aprovados com </w:t>
-      </w:r>
-      <w:proofErr w:type="spellStart"/>
-      <w:r>
-        <w:rPr>
-          <w:sz w:val="24"/>
-          <w:szCs w:val="24"/>
-        </w:rPr>
-        <w:t>valor_total</w:t>
-      </w:r>
-      <w:proofErr w:type="spellEnd"/>
-      <w:r>
-        <w:rPr>
-          <w:sz w:val="24"/>
-          <w:szCs w:val="24"/>
-        </w:rPr>
-        <w:t xml:space="preserve"> entre R$ 100 e R$ 500, ordenados do maior para o menor valor.</w:t>
+        <w:t>Liste os pedidos aprovados com valor_total entre R$ 100 e R$ 500, ordenados do maior para o menor valor.</w:t>
       </w:r>
     </w:p>
     <w:p>
@@ -4298,21 +4080,12 @@
         </w:rPr>
         <w:t>(</w:t>
       </w:r>
-      <w:proofErr w:type="spellStart"/>
-      <w:r>
-        <w:rPr>
-          <w:b/>
-          <w:bCs/>
-        </w:rPr>
-        <w:t>Emilly</w:t>
-      </w:r>
-      <w:proofErr w:type="spellEnd"/>
-      <w:r>
-        <w:rPr>
-          <w:b/>
-          <w:bCs/>
-        </w:rPr>
-        <w:t xml:space="preserve"> da Silva da Luz </w:t>
+      <w:r>
+        <w:rPr>
+          <w:b/>
+          <w:bCs/>
+        </w:rPr>
+        <w:t xml:space="preserve">Emilly da Silva da Luz </w:t>
       </w:r>
       <w:r>
         <w:rPr>
@@ -4530,21 +4303,12 @@
         </w:rPr>
         <w:t>(</w:t>
       </w:r>
-      <w:proofErr w:type="spellStart"/>
-      <w:r>
-        <w:rPr>
-          <w:b/>
-          <w:bCs/>
-        </w:rPr>
-        <w:t>Emilly</w:t>
-      </w:r>
-      <w:proofErr w:type="spellEnd"/>
-      <w:r>
-        <w:rPr>
-          <w:b/>
-          <w:bCs/>
-        </w:rPr>
-        <w:t xml:space="preserve"> da Silva da Luz </w:t>
+      <w:r>
+        <w:rPr>
+          <w:b/>
+          <w:bCs/>
+        </w:rPr>
+        <w:t xml:space="preserve">Emilly da Silva da Luz </w:t>
       </w:r>
       <w:r>
         <w:rPr>
@@ -4593,39 +4357,7 @@
           <w:sz w:val="24"/>
           <w:szCs w:val="24"/>
         </w:rPr>
-        <w:t xml:space="preserve">Liste id, </w:t>
-      </w:r>
-      <w:proofErr w:type="spellStart"/>
-      <w:r>
-        <w:rPr>
-          <w:sz w:val="24"/>
-          <w:szCs w:val="24"/>
-        </w:rPr>
-        <w:t>valor_total</w:t>
-      </w:r>
-      <w:proofErr w:type="spellEnd"/>
-      <w:r>
-        <w:rPr>
-          <w:sz w:val="24"/>
-          <w:szCs w:val="24"/>
-        </w:rPr>
-        <w:t xml:space="preserve"> e </w:t>
-      </w:r>
-      <w:proofErr w:type="spellStart"/>
-      <w:r>
-        <w:rPr>
-          <w:sz w:val="24"/>
-          <w:szCs w:val="24"/>
-        </w:rPr>
-        <w:t>cupom_desconto</w:t>
-      </w:r>
-      <w:proofErr w:type="spellEnd"/>
-      <w:r>
-        <w:rPr>
-          <w:sz w:val="24"/>
-          <w:szCs w:val="24"/>
-        </w:rPr>
-        <w:t xml:space="preserve"> dos pedidos que tiveram cupom aplicado (não nulo).</w:t>
+        <w:t>Liste id, valor_total e cupom_desconto dos pedidos que tiveram cupom aplicado (não nulo).</w:t>
       </w:r>
     </w:p>
     <w:p>
@@ -4899,7 +4631,6 @@
         </w:rPr>
         <w:t xml:space="preserve">A operação atingiu 8.448 pedidos aprovados, gerando um ticket médio de R$: 1.657,63 por venda. Além disso, a diferença entre o menor e o maior valor indica que a grande variedade de produtos da </w:t>
       </w:r>
-      <w:proofErr w:type="spellStart"/>
       <w:r>
         <w:rPr>
           <w:sz w:val="24"/>
@@ -4912,15 +4643,7 @@
           <w:sz w:val="24"/>
           <w:szCs w:val="24"/>
         </w:rPr>
-        <w:t>exashop</w:t>
-      </w:r>
-      <w:proofErr w:type="spellEnd"/>
-      <w:r>
-        <w:rPr>
-          <w:sz w:val="24"/>
-          <w:szCs w:val="24"/>
-        </w:rPr>
-        <w:t xml:space="preserve"> atende desde pedidos pequenos até compras em massa.</w:t>
+        <w:t>exashop atende desde pedidos pequenos até compras em massa.</w:t>
       </w:r>
     </w:p>
     <w:p>
@@ -5124,23 +4847,7 @@
           <w:sz w:val="24"/>
           <w:szCs w:val="24"/>
         </w:rPr>
-        <w:t xml:space="preserve">O Cartão de Crédito é a principal fonte de fatura da </w:t>
-      </w:r>
-      <w:proofErr w:type="spellStart"/>
-      <w:r>
-        <w:rPr>
-          <w:sz w:val="24"/>
-          <w:szCs w:val="24"/>
-        </w:rPr>
-        <w:t>NexaShop</w:t>
-      </w:r>
-      <w:proofErr w:type="spellEnd"/>
-      <w:r>
-        <w:rPr>
-          <w:sz w:val="24"/>
-          <w:szCs w:val="24"/>
-        </w:rPr>
-        <w:t xml:space="preserve"> com 6.29 milhões, seguido de perto pelo Pix, com 5.21 milhões, em seguida o boleto, com 1.29 milhões e por último o cartão de débito com 1.1 milhões.</w:t>
+        <w:t>O Cartão de Crédito é a principal fonte de fatura da NexaShop com 6.29 milhões, seguido de perto pelo Pix, com 5.21 milhões, em seguida o boleto, com 1.29 milhões e por último o cartão de débito com 1.1 milhões.</w:t>
       </w:r>
     </w:p>
     <w:p>
@@ -5484,21 +5191,12 @@
         </w:rPr>
         <w:t>(</w:t>
       </w:r>
-      <w:proofErr w:type="spellStart"/>
-      <w:r>
-        <w:rPr>
-          <w:b/>
-          <w:bCs/>
-        </w:rPr>
-        <w:t>Emilly</w:t>
-      </w:r>
-      <w:proofErr w:type="spellEnd"/>
-      <w:r>
-        <w:rPr>
-          <w:b/>
-          <w:bCs/>
-        </w:rPr>
-        <w:t xml:space="preserve"> da Silva da Luz </w:t>
+      <w:r>
+        <w:rPr>
+          <w:b/>
+          <w:bCs/>
+        </w:rPr>
+        <w:t xml:space="preserve">Emilly da Silva da Luz </w:t>
       </w:r>
       <w:r>
         <w:rPr>
@@ -5714,21 +5412,12 @@
         </w:rPr>
         <w:t>(</w:t>
       </w:r>
-      <w:proofErr w:type="spellStart"/>
-      <w:r>
-        <w:rPr>
-          <w:b/>
-          <w:bCs/>
-        </w:rPr>
-        <w:t>Emilly</w:t>
-      </w:r>
-      <w:proofErr w:type="spellEnd"/>
-      <w:r>
-        <w:rPr>
-          <w:b/>
-          <w:bCs/>
-        </w:rPr>
-        <w:t xml:space="preserve"> da Silva da Luz </w:t>
+      <w:r>
+        <w:rPr>
+          <w:b/>
+          <w:bCs/>
+        </w:rPr>
+        <w:t xml:space="preserve">Emilly da Silva da Luz </w:t>
       </w:r>
       <w:r>
         <w:rPr>
@@ -5936,21 +5625,12 @@
         </w:rPr>
         <w:t>(</w:t>
       </w:r>
-      <w:proofErr w:type="spellStart"/>
-      <w:r>
-        <w:rPr>
-          <w:b/>
-          <w:bCs/>
-        </w:rPr>
-        <w:t>Emilly</w:t>
-      </w:r>
-      <w:proofErr w:type="spellEnd"/>
-      <w:r>
-        <w:rPr>
-          <w:b/>
-          <w:bCs/>
-        </w:rPr>
-        <w:t xml:space="preserve"> da Silva da Luz </w:t>
+      <w:r>
+        <w:rPr>
+          <w:b/>
+          <w:bCs/>
+        </w:rPr>
+        <w:t xml:space="preserve">Emilly da Silva da Luz </w:t>
       </w:r>
       <w:r>
         <w:rPr>
@@ -6274,23 +5954,7 @@
           <w:sz w:val="24"/>
           <w:szCs w:val="24"/>
         </w:rPr>
-        <w:t xml:space="preserve">A conversão de notas numéricas em texto facilita o acompanhamento da satisfação do cliente, porém, esse </w:t>
-      </w:r>
-      <w:proofErr w:type="spellStart"/>
-      <w:r>
-        <w:rPr>
-          <w:sz w:val="24"/>
-          <w:szCs w:val="24"/>
-        </w:rPr>
-        <w:t>select</w:t>
-      </w:r>
-      <w:proofErr w:type="spellEnd"/>
-      <w:r>
-        <w:rPr>
-          <w:sz w:val="24"/>
-          <w:szCs w:val="24"/>
-        </w:rPr>
-        <w:t xml:space="preserve"> por si só não informa muita coisa, servindo mais como um “tradutor” entre as avaliações.</w:t>
+        <w:t>A conversão de notas numéricas em texto facilita o acompanhamento da satisfação do cliente, porém, esse select por si só não informa muita coisa, servindo mais como um “tradutor” entre as avaliações.</w:t>
       </w:r>
     </w:p>
     <w:p>
@@ -6500,53 +6164,12 @@
         </w:rPr>
         <w:t xml:space="preserve"> </w:t>
       </w:r>
-      <w:proofErr w:type="spellStart"/>
-      <w:r>
-        <w:rPr>
-          <w:sz w:val="24"/>
-          <w:szCs w:val="24"/>
-        </w:rPr>
-        <w:t>Select</w:t>
-      </w:r>
-      <w:proofErr w:type="spellEnd"/>
-      <w:r>
-        <w:rPr>
-          <w:sz w:val="24"/>
-          <w:szCs w:val="24"/>
-        </w:rPr>
-        <w:t xml:space="preserve"> </w:t>
-      </w:r>
-      <w:proofErr w:type="spellStart"/>
-      <w:r>
-        <w:rPr>
-          <w:sz w:val="24"/>
-          <w:szCs w:val="24"/>
-        </w:rPr>
-        <w:t>util</w:t>
-      </w:r>
-      <w:proofErr w:type="spellEnd"/>
-      <w:r>
-        <w:rPr>
-          <w:sz w:val="24"/>
-          <w:szCs w:val="24"/>
-        </w:rPr>
-        <w:t xml:space="preserve"> para visualizar as avaliações em ordem de maior quantidade para menor, com base nos resultados maior parte das avaliações da </w:t>
-      </w:r>
-      <w:proofErr w:type="spellStart"/>
-      <w:r>
-        <w:rPr>
-          <w:sz w:val="24"/>
-          <w:szCs w:val="24"/>
-        </w:rPr>
-        <w:t>nexashop</w:t>
-      </w:r>
-      <w:proofErr w:type="spellEnd"/>
-      <w:r>
-        <w:rPr>
-          <w:sz w:val="24"/>
-          <w:szCs w:val="24"/>
-        </w:rPr>
-        <w:t xml:space="preserve"> são positivas, pois mais de 70% das avaliações são "Excelente" ou "Boa". No entanto, as 882 notas "Insatisfatórias" e 890 "Regulares" somam mais de 1.700 alertas para a gestão. Trata-se de uma oportunidade direta para ajustar processos de entrega e suporte pós-venda.</w:t>
+      <w:r>
+        <w:rPr>
+          <w:sz w:val="24"/>
+          <w:szCs w:val="24"/>
+        </w:rPr>
+        <w:t>Select util para visualizar as avaliações em ordem de maior quantidade para menor, com base nos resultados maior parte das avaliações da nexashop são positivas, pois mais de 70% das avaliações são "Excelente" ou "Boa". No entanto, as 882 notas "Insatisfatórias" e 890 "Regulares" somam mais de 1.700 alertas para a gestão. Trata-se de uma oportunidade direta para ajustar processos de entrega e suporte pós-venda.</w:t>
       </w:r>
     </w:p>
     <w:p>
@@ -6668,25 +6291,14 @@
         </w:rPr>
         <w:t>(</w:t>
       </w:r>
-      <w:proofErr w:type="spellStart"/>
-      <w:r>
-        <w:rPr>
-          <w:b/>
-          <w:bCs/>
-          <w:sz w:val="24"/>
-          <w:szCs w:val="24"/>
-        </w:rPr>
-        <w:t>Emilly</w:t>
-      </w:r>
-      <w:proofErr w:type="spellEnd"/>
-      <w:r>
-        <w:rPr>
-          <w:b/>
-          <w:bCs/>
-          <w:sz w:val="24"/>
-          <w:szCs w:val="24"/>
-        </w:rPr>
-        <w:t xml:space="preserve"> da Silva da Luz </w:t>
+      <w:r>
+        <w:rPr>
+          <w:b/>
+          <w:bCs/>
+          <w:sz w:val="24"/>
+          <w:szCs w:val="24"/>
+        </w:rPr>
+        <w:t xml:space="preserve">Emilly da Silva da Luz </w:t>
       </w:r>
       <w:r>
         <w:rPr>
@@ -6910,25 +6522,14 @@
         </w:rPr>
         <w:t>(</w:t>
       </w:r>
-      <w:proofErr w:type="spellStart"/>
-      <w:r>
-        <w:rPr>
-          <w:b/>
-          <w:bCs/>
-          <w:sz w:val="24"/>
-          <w:szCs w:val="24"/>
-        </w:rPr>
-        <w:t>Emilly</w:t>
-      </w:r>
-      <w:proofErr w:type="spellEnd"/>
-      <w:r>
-        <w:rPr>
-          <w:b/>
-          <w:bCs/>
-          <w:sz w:val="24"/>
-          <w:szCs w:val="24"/>
-        </w:rPr>
-        <w:t xml:space="preserve"> da Silva da Luz </w:t>
+      <w:r>
+        <w:rPr>
+          <w:b/>
+          <w:bCs/>
+          <w:sz w:val="24"/>
+          <w:szCs w:val="24"/>
+        </w:rPr>
+        <w:t xml:space="preserve">Emilly da Silva da Luz </w:t>
       </w:r>
       <w:r>
         <w:rPr>
@@ -7275,25 +6876,14 @@
         </w:rPr>
         <w:t>(</w:t>
       </w:r>
-      <w:proofErr w:type="spellStart"/>
-      <w:r>
-        <w:rPr>
-          <w:b/>
-          <w:bCs/>
-          <w:sz w:val="24"/>
-          <w:szCs w:val="24"/>
-        </w:rPr>
-        <w:t>Emilly</w:t>
-      </w:r>
-      <w:proofErr w:type="spellEnd"/>
-      <w:r>
-        <w:rPr>
-          <w:b/>
-          <w:bCs/>
-          <w:sz w:val="24"/>
-          <w:szCs w:val="24"/>
-        </w:rPr>
-        <w:t xml:space="preserve"> da Silva da Luz </w:t>
+      <w:r>
+        <w:rPr>
+          <w:b/>
+          <w:bCs/>
+          <w:sz w:val="24"/>
+          <w:szCs w:val="24"/>
+        </w:rPr>
+        <w:t xml:space="preserve">Emilly da Silva da Luz </w:t>
       </w:r>
       <w:r>
         <w:rPr>
@@ -7331,39 +6921,7 @@
           <w:sz w:val="24"/>
           <w:szCs w:val="24"/>
         </w:rPr>
-        <w:t xml:space="preserve">Entre os pedidos aprovados, mostre </w:t>
-      </w:r>
-      <w:proofErr w:type="spellStart"/>
-      <w:r>
-        <w:rPr>
-          <w:sz w:val="24"/>
-          <w:szCs w:val="24"/>
-        </w:rPr>
-        <w:t>canal_venda</w:t>
-      </w:r>
-      <w:proofErr w:type="spellEnd"/>
-      <w:r>
-        <w:rPr>
-          <w:sz w:val="24"/>
-          <w:szCs w:val="24"/>
-        </w:rPr>
-        <w:t xml:space="preserve">, </w:t>
-      </w:r>
-      <w:proofErr w:type="spellStart"/>
-      <w:r>
-        <w:rPr>
-          <w:sz w:val="24"/>
-          <w:szCs w:val="24"/>
-        </w:rPr>
-        <w:t>forma_pagamento</w:t>
-      </w:r>
-      <w:proofErr w:type="spellEnd"/>
-      <w:r>
-        <w:rPr>
-          <w:sz w:val="24"/>
-          <w:szCs w:val="24"/>
-        </w:rPr>
-        <w:t>, quantidade de pedidos e faturamento, considerando apenas combinações com pelo menos 200 pedidos. Ordene pelo faturamento e mostre somente as 5 primeiras combinações</w:t>
+        <w:t>Entre os pedidos aprovados, mostre canal_venda, forma_pagamento, quantidade de pedidos e faturamento, considerando apenas combinações com pelo menos 200 pedidos. Ordene pelo faturamento e mostre somente as 5 primeiras combinações</w:t>
       </w:r>
       <w:r>
         <w:rPr>
@@ -7402,23 +6960,7 @@
           <w:sz w:val="24"/>
           <w:szCs w:val="24"/>
         </w:rPr>
-        <w:t xml:space="preserve">Observamos pela consulta, que a </w:t>
-      </w:r>
-      <w:proofErr w:type="spellStart"/>
-      <w:r>
-        <w:rPr>
-          <w:sz w:val="24"/>
-          <w:szCs w:val="24"/>
-        </w:rPr>
-        <w:t>Nexashop</w:t>
-      </w:r>
-      <w:proofErr w:type="spellEnd"/>
-      <w:r>
-        <w:rPr>
-          <w:sz w:val="24"/>
-          <w:szCs w:val="24"/>
-        </w:rPr>
-        <w:t xml:space="preserve"> possui com menor faturamento no Site pela forma de pagamento Cartão de Débito.</w:t>
+        <w:t>Observamos pela consulta, que a Nexashop possui com menor faturamento no Site pela forma de pagamento Cartão de Débito.</w:t>
       </w:r>
     </w:p>
     <w:p>
@@ -7716,25 +7258,14 @@
         </w:rPr>
         <w:t>(</w:t>
       </w:r>
-      <w:proofErr w:type="spellStart"/>
-      <w:r>
-        <w:rPr>
-          <w:b/>
-          <w:bCs/>
-          <w:sz w:val="24"/>
-          <w:szCs w:val="24"/>
-        </w:rPr>
-        <w:t>Emilly</w:t>
-      </w:r>
-      <w:proofErr w:type="spellEnd"/>
-      <w:r>
-        <w:rPr>
-          <w:b/>
-          <w:bCs/>
-          <w:sz w:val="24"/>
-          <w:szCs w:val="24"/>
-        </w:rPr>
-        <w:t xml:space="preserve"> da Silva da Luz</w:t>
+      <w:r>
+        <w:rPr>
+          <w:b/>
+          <w:bCs/>
+          <w:sz w:val="24"/>
+          <w:szCs w:val="24"/>
+        </w:rPr>
+        <w:t>Emilly da Silva da Luz</w:t>
       </w:r>
       <w:r>
         <w:rPr>
@@ -8106,25 +7637,14 @@
         </w:rPr>
         <w:t>(</w:t>
       </w:r>
-      <w:proofErr w:type="spellStart"/>
-      <w:r>
-        <w:rPr>
-          <w:b/>
-          <w:bCs/>
-          <w:sz w:val="24"/>
-          <w:szCs w:val="24"/>
-        </w:rPr>
-        <w:t>Emilly</w:t>
-      </w:r>
-      <w:proofErr w:type="spellEnd"/>
-      <w:r>
-        <w:rPr>
-          <w:b/>
-          <w:bCs/>
-          <w:sz w:val="24"/>
-          <w:szCs w:val="24"/>
-        </w:rPr>
-        <w:t xml:space="preserve"> da Silva da Luz </w:t>
+      <w:r>
+        <w:rPr>
+          <w:b/>
+          <w:bCs/>
+          <w:sz w:val="24"/>
+          <w:szCs w:val="24"/>
+        </w:rPr>
+        <w:t xml:space="preserve">Emilly da Silva da Luz </w:t>
       </w:r>
       <w:r>
         <w:rPr>
@@ -8151,23 +7671,7 @@
           <w:sz w:val="24"/>
           <w:szCs w:val="24"/>
         </w:rPr>
-        <w:t xml:space="preserve">Em uma reunião, um gestor da </w:t>
-      </w:r>
-      <w:proofErr w:type="spellStart"/>
-      <w:r>
-        <w:rPr>
-          <w:sz w:val="24"/>
-          <w:szCs w:val="24"/>
-        </w:rPr>
-        <w:t>NexaShop</w:t>
-      </w:r>
-      <w:proofErr w:type="spellEnd"/>
-      <w:r>
-        <w:rPr>
-          <w:sz w:val="24"/>
-          <w:szCs w:val="24"/>
-        </w:rPr>
-        <w:t xml:space="preserve"> afirmou que "pedidos pagos por boleto parecem cancelar mais". Isso é uma hipótese, não um fato — é trabalho da dupla confirmar ou refutar com dados, sem aceitar a afirmação apenas porque veio de um gestor.</w:t>
+        <w:t>Em uma reunião, um gestor da NexaShop afirmou que "pedidos pagos por boleto parecem cancelar mais". Isso é uma hipótese, não um fato — é trabalho da dupla confirmar ou refutar com dados, sem aceitar a afirmação apenas porque veio de um gestor.</w:t>
       </w:r>
       <w:r>
         <w:rPr>
@@ -8291,10 +7795,10 @@
           <w:noProof/>
         </w:rPr>
         <w:drawing>
-          <wp:inline distT="0" distB="0" distL="0" distR="0" wp14:anchorId="23A9C4E1" wp14:editId="72E50383">
-            <wp:extent cx="5748020" cy="3176270"/>
-            <wp:effectExtent l="0" t="0" r="5080" b="5080"/>
-            <wp:docPr id="811328209" name="Imagem 811328209"/>
+          <wp:inline distT="0" distB="0" distL="0" distR="0" wp14:anchorId="40948605" wp14:editId="2B4430A3">
+            <wp:extent cx="5743575" cy="3133725"/>
+            <wp:effectExtent l="0" t="0" r="9525" b="9525"/>
+            <wp:docPr id="2" name="Imagem 2"/>
             <wp:cNvGraphicFramePr>
               <a:graphicFrameLocks xmlns:a="http://schemas.openxmlformats.org/drawingml/2006/main" noChangeAspect="1"/>
             </wp:cNvGraphicFramePr>
@@ -8302,7 +7806,7 @@
               <a:graphicData uri="http://schemas.openxmlformats.org/drawingml/2006/picture">
                 <pic:pic xmlns:pic="http://schemas.openxmlformats.org/drawingml/2006/picture">
                   <pic:nvPicPr>
-                    <pic:cNvPr id="0" name="Picture 104"/>
+                    <pic:cNvPr id="0" name="Picture 1"/>
                     <pic:cNvPicPr>
                       <a:picLocks noChangeAspect="1" noChangeArrowheads="1"/>
                     </pic:cNvPicPr>
@@ -8323,7 +7827,7 @@
                   <pic:spPr bwMode="auto">
                     <a:xfrm>
                       <a:off x="0" y="0"/>
-                      <a:ext cx="5748020" cy="3176270"/>
+                      <a:ext cx="5743575" cy="3133725"/>
                     </a:xfrm>
                     <a:prstGeom prst="rect">
                       <a:avLst/>
@@ -8392,23 +7896,7 @@
           <w:sz w:val="24"/>
           <w:szCs w:val="24"/>
         </w:rPr>
-        <w:t xml:space="preserve">uais cidades geram mais faturamento para a </w:t>
-      </w:r>
-      <w:proofErr w:type="spellStart"/>
-      <w:r>
-        <w:rPr>
-          <w:sz w:val="24"/>
-          <w:szCs w:val="24"/>
-        </w:rPr>
-        <w:t>NexaShop</w:t>
-      </w:r>
-      <w:proofErr w:type="spellEnd"/>
-      <w:r>
-        <w:rPr>
-          <w:sz w:val="24"/>
-          <w:szCs w:val="24"/>
-        </w:rPr>
-        <w:t>?</w:t>
+        <w:t>uais cidades geram mais faturamento para a NexaShop?</w:t>
       </w:r>
     </w:p>
     <w:p>
@@ -8423,14 +7911,14 @@
           <w:sz w:val="24"/>
           <w:szCs w:val="24"/>
         </w:rPr>
-        <w:t xml:space="preserve">Resultado: </w:t>
-      </w:r>
-      <w:r>
-        <w:rPr>
-          <w:sz w:val="24"/>
-          <w:szCs w:val="24"/>
-        </w:rPr>
-        <w:t xml:space="preserve">Criciúma, </w:t>
+        <w:t>Resultado:</w:t>
+      </w:r>
+      <w:r>
+        <w:rPr>
+          <w:sz w:val="24"/>
+          <w:szCs w:val="24"/>
+        </w:rPr>
+        <w:t xml:space="preserve"> </w:t>
       </w:r>
       <w:r>
         <w:rPr>
@@ -8444,7 +7932,23 @@
           <w:sz w:val="24"/>
           <w:szCs w:val="24"/>
         </w:rPr>
-        <w:t xml:space="preserve"> e Itajaí são as 3 cidades que mais geram faturamento.</w:t>
+        <w:t>,</w:t>
+      </w:r>
+      <w:r>
+        <w:rPr>
+          <w:b/>
+          <w:bCs/>
+          <w:sz w:val="24"/>
+          <w:szCs w:val="24"/>
+        </w:rPr>
+        <w:t xml:space="preserve"> </w:t>
+      </w:r>
+      <w:r>
+        <w:rPr>
+          <w:sz w:val="24"/>
+          <w:szCs w:val="24"/>
+        </w:rPr>
+        <w:t>Criciúma e Itajaí são as 3 cidades que mais geram faturamento.</w:t>
       </w:r>
     </w:p>
     <w:p>
@@ -8769,6 +8273,7 @@
       </w:pPr>
       <w:r>
         <w:rPr>
+          <w:noProof/>
           <w:sz w:val="24"/>
           <w:szCs w:val="24"/>
         </w:rPr>
@@ -8864,6 +8369,7 @@
         <w:rPr>
           <w:b/>
           <w:bCs/>
+          <w:noProof/>
           <w:sz w:val="24"/>
           <w:szCs w:val="24"/>
         </w:rPr>
@@ -8998,23 +8504,7 @@
           <w:rFonts w:ascii="Arial" w:hAnsi="Arial" w:cs="Arial"/>
           <w:color w:val="000000" w:themeColor="text1"/>
         </w:rPr>
-        <w:t xml:space="preserve">Os 3 principais insights encontrados e 1 recomendação de negócio para a </w:t>
-      </w:r>
-      <w:proofErr w:type="spellStart"/>
-      <w:r>
-        <w:rPr>
-          <w:rFonts w:ascii="Arial" w:hAnsi="Arial" w:cs="Arial"/>
-          <w:color w:val="000000" w:themeColor="text1"/>
-        </w:rPr>
-        <w:t>NexaShop</w:t>
-      </w:r>
-      <w:proofErr w:type="spellEnd"/>
-      <w:r>
-        <w:rPr>
-          <w:rFonts w:ascii="Arial" w:hAnsi="Arial" w:cs="Arial"/>
-          <w:color w:val="000000" w:themeColor="text1"/>
-        </w:rPr>
-        <w:t xml:space="preserve">. </w:t>
+        <w:t xml:space="preserve">Os 3 principais insights encontrados e 1 recomendação de negócio para a NexaShop. </w:t>
       </w:r>
       <w:r>
         <w:rPr>
@@ -9061,14 +8551,7 @@
           <w:rFonts w:ascii="Arial" w:hAnsi="Arial" w:cs="Arial"/>
           <w:color w:val="000000"/>
         </w:rPr>
-        <w:t>esse resultado pode indicar uma maior desistência dos clientes que escolhem pagar por boleto, já que a geração do boleto não significa necessariamente que o pagamento será realizado. Isso pode representar vendas iniciadas que não chegam a ser concluídas.</w:t>
-      </w:r>
-      <w:r>
-        <w:rPr>
-          <w:rFonts w:ascii="Arial" w:hAnsi="Arial" w:cs="Arial"/>
-          <w:color w:val="000000"/>
-        </w:rPr>
-        <w:t xml:space="preserve"> </w:t>
+        <w:t xml:space="preserve">esse resultado pode indicar uma maior desistência dos clientes que escolhem pagar por boleto, já que a geração do boleto não significa necessariamente que o pagamento será realizado. Isso pode representar vendas iniciadas que não chegam a ser concluídas. </w:t>
       </w:r>
     </w:p>
     <w:p>
@@ -9220,7 +8703,6 @@
         </w:rPr>
         <w:t>(</w:t>
       </w:r>
-      <w:proofErr w:type="spellStart"/>
       <w:r>
         <w:rPr>
           <w:rFonts w:ascii="Arial" w:hAnsi="Arial" w:cs="Arial"/>
@@ -9228,17 +8710,7 @@
           <w:bCs/>
           <w:color w:val="000000"/>
         </w:rPr>
-        <w:t>Emilly</w:t>
-      </w:r>
-      <w:proofErr w:type="spellEnd"/>
-      <w:r>
-        <w:rPr>
-          <w:rFonts w:ascii="Arial" w:hAnsi="Arial" w:cs="Arial"/>
-          <w:b/>
-          <w:bCs/>
-          <w:color w:val="000000"/>
-        </w:rPr>
-        <w:t xml:space="preserve"> da Silva da Luz</w:t>
+        <w:t>Emilly da Silva da Luz</w:t>
       </w:r>
       <w:r>
         <w:rPr>
@@ -9325,21 +8797,7 @@
           <w:rFonts w:ascii="Arial" w:hAnsi="Arial" w:cs="Arial"/>
           <w:color w:val="000000"/>
         </w:rPr>
-        <w:t>Dos 500 pedidos registrados, 350 foram aprovados, representando uma taxa de aprovação de 70%. Isso significa que aproximadamente 30% dos pedidos não chegam à aprovação, ficando entre cancelados, pendentes ou reembolsados.</w:t>
-      </w:r>
-      <w:r>
-        <w:rPr>
-          <w:rFonts w:ascii="Arial" w:hAnsi="Arial" w:cs="Arial"/>
-          <w:color w:val="000000"/>
-        </w:rPr>
-        <w:t xml:space="preserve"> </w:t>
-      </w:r>
-      <w:r>
-        <w:rPr>
-          <w:rFonts w:ascii="Arial" w:hAnsi="Arial" w:cs="Arial"/>
-          <w:color w:val="000000"/>
-        </w:rPr>
-        <w:t>o pagamento, e nesse tempo o cliente muda de ideia</w:t>
+        <w:t>Dos 500 pedidos registrados, 350 foram aprovados, representando uma taxa de aprovação de 70%. Isso significa que aproximadamente 30% dos pedidos não chegam à aprovação, ficando entre cancelados, pendentes ou reembolsados. o pagamento, e nesse tempo o cliente muda de ideia</w:t>
       </w:r>
       <w:r>
         <w:rPr>
@@ -9795,33 +9253,7 @@
           <w:szCs w:val="24"/>
           <w:lang w:eastAsia="pt-BR"/>
         </w:rPr>
-        <w:t>(</w:t>
-      </w:r>
-      <w:proofErr w:type="spellStart"/>
-      <w:r>
-        <w:rPr>
-          <w:rFonts w:eastAsia="Times New Roman"/>
-          <w:b/>
-          <w:bCs/>
-          <w:color w:val="000000"/>
-          <w:sz w:val="24"/>
-          <w:szCs w:val="24"/>
-          <w:lang w:eastAsia="pt-BR"/>
-        </w:rPr>
-        <w:t>Emilly</w:t>
-      </w:r>
-      <w:proofErr w:type="spellEnd"/>
-      <w:r>
-        <w:rPr>
-          <w:rFonts w:eastAsia="Times New Roman"/>
-          <w:b/>
-          <w:bCs/>
-          <w:color w:val="000000"/>
-          <w:sz w:val="24"/>
-          <w:szCs w:val="24"/>
-          <w:lang w:eastAsia="pt-BR"/>
-        </w:rPr>
-        <w:t xml:space="preserve"> da Silva da Luz - 2026)</w:t>
+        <w:t>(Emilly da Silva da Luz - 2026)</w:t>
       </w:r>
       <w:r>
         <w:rPr>
@@ -9883,29 +9315,7 @@
           <w:szCs w:val="24"/>
           <w:lang w:eastAsia="pt-BR"/>
         </w:rPr>
-        <w:t xml:space="preserve">Foi identificado que existem clientes cadastrados sem número de telefone, apresentando valores nulos nesse campo. Recomenda-se que a </w:t>
-      </w:r>
-      <w:proofErr w:type="spellStart"/>
-      <w:r>
-        <w:rPr>
-          <w:rFonts w:eastAsia="Times New Roman"/>
-          <w:color w:val="000000"/>
-          <w:sz w:val="24"/>
-          <w:szCs w:val="24"/>
-          <w:lang w:eastAsia="pt-BR"/>
-        </w:rPr>
-        <w:t>NexaShop</w:t>
-      </w:r>
-      <w:proofErr w:type="spellEnd"/>
-      <w:r>
-        <w:rPr>
-          <w:rFonts w:eastAsia="Times New Roman"/>
-          <w:color w:val="000000"/>
-          <w:sz w:val="24"/>
-          <w:szCs w:val="24"/>
-          <w:lang w:eastAsia="pt-BR"/>
-        </w:rPr>
-        <w:t xml:space="preserve"> incentive a atualização desses dados e implemente validações no momento do cadastro para reduzir a quantidade de informações ausentes.</w:t>
+        <w:t>Foi identificado que existem clientes cadastrados sem número de telefone, apresentando valores nulos nesse campo. Recomenda-se que a NexaShop incentive a atualização desses dados e implemente validações no momento do cadastro para reduzir a quantidade de informações ausentes.</w:t>
       </w:r>
     </w:p>
     <w:p>
@@ -13056,6 +12466,7 @@
   <w:style w:type="character" w:default="1" w:styleId="Fontepargpadro">
     <w:name w:val="Default Paragraph Font"/>
     <w:uiPriority w:val="1"/>
+    <w:semiHidden/>
     <w:unhideWhenUsed/>
   </w:style>
   <w:style w:type="table" w:default="1" w:styleId="Tabelanormal">

</xml_diff>